<commit_message>
Roteiro Asaas: campos obrigatorios do webhook (tipo de envio, fila, token)
Co-Authored-By: Claude Sonnet 5.5 <noreply@anthropic.com>
</commit_message>
<xml_diff>
--- a/entregas/Asaas e Turnstile - passo a passo.docx
+++ b/entregas/Asaas e Turnstile - passo a passo.docx
@@ -294,7 +294,7 @@
       </w:pPr>
       <w:r>
         <w:rPr/>
-        <w:t xml:space="preserve">A4. Criar o token do webhook</w:t>
+        <w:t xml:space="preserve">A4. Token do webhook</w:t>
       </w:r>
     </w:p>
     <w:p>
@@ -313,7 +313,17 @@
       </w:r>
       <w:r>
         <w:rPr/>
-        <w:t xml:space="preserve"> Invente uma sequência longa (32 caracteres ou mais, com letras e números) ou gere no seu computador:</w:t>
+        <w:t xml:space="preserve"> O mais simples é usar o botão </w:t>
+      </w:r>
+      <w:r>
+        <w:rPr>
+          <w:b/>
+        </w:rPr>
+        <w:t xml:space="preserve">Gerar Token</w:t>
+      </w:r>
+      <w:r>
+        <w:rPr/>
+        <w:t xml:space="preserve"> da própria tela do webhook (A5). Se preferir criar um, use 32 caracteres ou mais, ou gere no seu computador:</w:t>
       </w:r>
     </w:p>
     <w:p>
@@ -356,105 +366,453 @@
     </w:p>
     <w:p>
       <w:pPr>
-        <w:spacing w:after="80"/>
-        <w:ind w:left="560" w:hanging="400"/>
-      </w:pPr>
-      <w:r>
-        <w:rPr>
-          <w:b/>
-        </w:rPr>
-        <w:t xml:space="preserve">1.  </w:t>
-      </w:r>
-      <w:r>
-        <w:rPr>
-          <w:b/>
-        </w:rPr>
-        <w:t xml:space="preserve">Integrações → Webhooks → Criar webhook.</w:t>
-      </w:r>
-    </w:p>
-    <w:p>
-      <w:pPr>
-        <w:spacing w:after="80"/>
-        <w:ind w:left="560" w:hanging="400"/>
-      </w:pPr>
-      <w:r>
-        <w:rPr>
-          <w:b/>
-        </w:rPr>
-        <w:t xml:space="preserve">2.  </w:t>
-      </w:r>
-      <w:r>
-        <w:rPr>
-          <w:b/>
-        </w:rPr>
-        <w:t xml:space="preserve">Nome:</w:t>
-      </w:r>
-      <w:r>
-        <w:rPr/>
-        <w:t xml:space="preserve"> Fôlego. </w:t>
-      </w:r>
-      <w:r>
-        <w:rPr>
-          <w:b/>
-        </w:rPr>
-        <w:t xml:space="preserve">URL:</w:t>
-      </w:r>
-      <w:r>
-        <w:rPr/>
-        <w:t xml:space="preserve"> </w:t>
-      </w:r>
-      <w:r>
-        <w:rPr>
-          <w:rFonts w:ascii="Consolas" w:hAnsi="Consolas" w:cs="Consolas"/>
-          <w:color w:val="7A2E0E"/>
-        </w:rPr>
-        <w:t xml:space="preserve">https://folego.online/webhooks/pix</w:t>
-      </w:r>
-      <w:r>
-        <w:rPr/>
-        <w:t xml:space="preserve">. </w:t>
-      </w:r>
-      <w:r>
-        <w:rPr>
-          <w:b/>
-        </w:rPr>
-        <w:t xml:space="preserve">Token de autenticação:</w:t>
-      </w:r>
-      <w:r>
-        <w:rPr/>
-        <w:t xml:space="preserve"> o valor do passo A4.</w:t>
-      </w:r>
-    </w:p>
-    <w:p>
-      <w:pPr>
-        <w:spacing w:after="80"/>
-        <w:ind w:left="560" w:hanging="400"/>
-      </w:pPr>
-      <w:r>
-        <w:rPr>
-          <w:b/>
-        </w:rPr>
-        <w:t xml:space="preserve">3.  </w:t>
-      </w:r>
-      <w:r>
-        <w:rPr>
-          <w:b/>
-        </w:rPr>
-        <w:t xml:space="preserve">Fila:</w:t>
-      </w:r>
-      <w:r>
-        <w:rPr/>
-        <w:t xml:space="preserve"> deixe a sincronização ligada. </w:t>
-      </w:r>
-      <w:r>
-        <w:rPr>
-          <w:b/>
-        </w:rPr>
-        <w:t xml:space="preserve">Eventos de cobrança:</w:t>
-      </w:r>
-      <w:r>
-        <w:rPr/>
-        <w:t xml:space="preserve"> marque </w:t>
+        <w:spacing w:after="120"/>
+      </w:pPr>
+      <w:r>
+        <w:rPr>
+          <w:b/>
+        </w:rPr>
+        <w:t xml:space="preserve">Integrações → Webhooks → Adicionar Webhook.</w:t>
+      </w:r>
+      <w:r>
+        <w:rPr/>
+        <w:t xml:space="preserve"> Preencha todos os campos, inclusive os obrigatórios:</w:t>
+      </w:r>
+    </w:p>
+    <w:tbl>
+      <w:tblPr>
+        <w:tblW w:w="9400" w:type="dxa"/>
+        <w:tblBorders>
+          <w:top w:val="single" w:sz="4" w:color="B9C4BE"/>
+          <w:left w:val="single" w:sz="4" w:color="B9C4BE"/>
+          <w:bottom w:val="single" w:sz="4" w:color="B9C4BE"/>
+          <w:right w:val="single" w:sz="4" w:color="B9C4BE"/>
+          <w:insideH w:val="single" w:sz="4" w:color="B9C4BE"/>
+          <w:insideV w:val="single" w:sz="4" w:color="B9C4BE"/>
+        </w:tblBorders>
+        <w:tblCellMar>
+          <w:top w:w="60" w:type="dxa"/>
+          <w:left w:w="100" w:type="dxa"/>
+          <w:bottom w:w="60" w:type="dxa"/>
+          <w:right w:w="100" w:type="dxa"/>
+        </w:tblCellMar>
+      </w:tblPr>
+      <w:tblGrid>
+        <w:gridCol w:w="4700"/>
+        <w:gridCol w:w="4700"/>
+      </w:tblGrid>
+      <w:tr>
+        <w:trPr>
+          <w:tblHeader/>
+        </w:trPr>
+        <w:tc>
+          <w:tcPr>
+            <w:tcW w:w="4700" w:type="dxa"/>
+            <w:shd w:val="clear" w:color="auto" w:fill="0E5B49"/>
+          </w:tcPr>
+          <w:p>
+            <w:pPr>
+              <w:spacing w:after="0"/>
+            </w:pPr>
+            <w:r>
+              <w:rPr>
+                <w:b/>
+                <w:color w:val="FFFFFF"/>
+                <w:sz w:val="20"/>
+              </w:rPr>
+              <w:t xml:space="preserve">Campo</w:t>
+            </w:r>
+          </w:p>
+        </w:tc>
+        <w:tc>
+          <w:tcPr>
+            <w:tcW w:w="4700" w:type="dxa"/>
+            <w:shd w:val="clear" w:color="auto" w:fill="0E5B49"/>
+          </w:tcPr>
+          <w:p>
+            <w:pPr>
+              <w:spacing w:after="0"/>
+            </w:pPr>
+            <w:r>
+              <w:rPr>
+                <w:b/>
+                <w:color w:val="FFFFFF"/>
+                <w:sz w:val="20"/>
+              </w:rPr>
+              <w:t xml:space="preserve">Valor</w:t>
+            </w:r>
+          </w:p>
+        </w:tc>
+      </w:tr>
+      <w:tr>
+        <w:tc>
+          <w:tcPr>
+            <w:tcW w:w="4700" w:type="dxa"/>
+          </w:tcPr>
+          <w:p>
+            <w:pPr>
+              <w:spacing w:after="0"/>
+            </w:pPr>
+            <w:r>
+              <w:rPr>
+                <w:sz w:val="20"/>
+              </w:rPr>
+              <w:t xml:space="preserve">Este Webhook ficará ativo?</w:t>
+            </w:r>
+          </w:p>
+        </w:tc>
+        <w:tc>
+          <w:tcPr>
+            <w:tcW w:w="4700" w:type="dxa"/>
+          </w:tcPr>
+          <w:p>
+            <w:pPr>
+              <w:spacing w:after="0"/>
+            </w:pPr>
+            <w:r>
+              <w:rPr>
+                <w:sz w:val="20"/>
+              </w:rPr>
+              <w:t xml:space="preserve">Ligado</w:t>
+            </w:r>
+          </w:p>
+        </w:tc>
+      </w:tr>
+      <w:tr>
+        <w:tc>
+          <w:tcPr>
+            <w:tcW w:w="4700" w:type="dxa"/>
+          </w:tcPr>
+          <w:p>
+            <w:pPr>
+              <w:spacing w:after="0"/>
+            </w:pPr>
+            <w:r>
+              <w:rPr>
+                <w:sz w:val="20"/>
+              </w:rPr>
+              <w:t xml:space="preserve">Nome do Webhook</w:t>
+            </w:r>
+          </w:p>
+        </w:tc>
+        <w:tc>
+          <w:tcPr>
+            <w:tcW w:w="4700" w:type="dxa"/>
+          </w:tcPr>
+          <w:p>
+            <w:pPr>
+              <w:spacing w:after="0"/>
+            </w:pPr>
+            <w:r>
+              <w:rPr>
+                <w:sz w:val="20"/>
+              </w:rPr>
+              <w:t xml:space="preserve">Fôlego</w:t>
+            </w:r>
+          </w:p>
+        </w:tc>
+      </w:tr>
+      <w:tr>
+        <w:tc>
+          <w:tcPr>
+            <w:tcW w:w="4700" w:type="dxa"/>
+          </w:tcPr>
+          <w:p>
+            <w:pPr>
+              <w:spacing w:after="0"/>
+            </w:pPr>
+            <w:r>
+              <w:rPr>
+                <w:sz w:val="20"/>
+              </w:rPr>
+              <w:t xml:space="preserve">URL do Webhook</w:t>
+            </w:r>
+          </w:p>
+        </w:tc>
+        <w:tc>
+          <w:tcPr>
+            <w:tcW w:w="4700" w:type="dxa"/>
+          </w:tcPr>
+          <w:p>
+            <w:pPr>
+              <w:spacing w:after="0"/>
+            </w:pPr>
+            <w:r>
+              <w:rPr>
+                <w:rFonts w:ascii="Consolas" w:hAnsi="Consolas" w:cs="Consolas"/>
+                <w:color w:val="7A2E0E"/>
+                <w:sz w:val="20"/>
+              </w:rPr>
+              <w:t xml:space="preserve">https://folego.online/webhooks/pix</w:t>
+            </w:r>
+          </w:p>
+        </w:tc>
+      </w:tr>
+      <w:tr>
+        <w:tc>
+          <w:tcPr>
+            <w:tcW w:w="4700" w:type="dxa"/>
+          </w:tcPr>
+          <w:p>
+            <w:pPr>
+              <w:spacing w:after="0"/>
+            </w:pPr>
+            <w:r>
+              <w:rPr>
+                <w:sz w:val="20"/>
+              </w:rPr>
+              <w:t xml:space="preserve">E-mail</w:t>
+            </w:r>
+          </w:p>
+        </w:tc>
+        <w:tc>
+          <w:tcPr>
+            <w:tcW w:w="4700" w:type="dxa"/>
+          </w:tcPr>
+          <w:p>
+            <w:pPr>
+              <w:spacing w:after="0"/>
+            </w:pPr>
+            <w:r>
+              <w:rPr>
+                <w:sz w:val="20"/>
+              </w:rPr>
+              <w:t xml:space="preserve">O seu (o Asaas avisa aqui se a entrega falhar)</w:t>
+            </w:r>
+          </w:p>
+        </w:tc>
+      </w:tr>
+      <w:tr>
+        <w:tc>
+          <w:tcPr>
+            <w:tcW w:w="4700" w:type="dxa"/>
+          </w:tcPr>
+          <w:p>
+            <w:pPr>
+              <w:spacing w:after="0"/>
+            </w:pPr>
+            <w:r>
+              <w:rPr>
+                <w:sz w:val="20"/>
+              </w:rPr>
+              <w:t xml:space="preserve">Versão da API</w:t>
+            </w:r>
+          </w:p>
+        </w:tc>
+        <w:tc>
+          <w:tcPr>
+            <w:tcW w:w="4700" w:type="dxa"/>
+          </w:tcPr>
+          <w:p>
+            <w:pPr>
+              <w:spacing w:after="0"/>
+            </w:pPr>
+            <w:r>
+              <w:rPr>
+                <w:sz w:val="20"/>
+              </w:rPr>
+              <w:t xml:space="preserve">v3</w:t>
+            </w:r>
+          </w:p>
+        </w:tc>
+      </w:tr>
+      <w:tr>
+        <w:tc>
+          <w:tcPr>
+            <w:tcW w:w="4700" w:type="dxa"/>
+          </w:tcPr>
+          <w:p>
+            <w:pPr>
+              <w:spacing w:after="0"/>
+            </w:pPr>
+            <w:r>
+              <w:rPr>
+                <w:b/>
+                <w:sz w:val="20"/>
+              </w:rPr>
+              <w:t xml:space="preserve">Tipo de envio</w:t>
+            </w:r>
+            <w:r>
+              <w:rPr>
+                <w:sz w:val="20"/>
+              </w:rPr>
+              <w:t xml:space="preserve"> (obrigatório)</w:t>
+            </w:r>
+          </w:p>
+        </w:tc>
+        <w:tc>
+          <w:tcPr>
+            <w:tcW w:w="4700" w:type="dxa"/>
+          </w:tcPr>
+          <w:p>
+            <w:pPr>
+              <w:spacing w:after="0"/>
+            </w:pPr>
+            <w:r>
+              <w:rPr>
+                <w:b/>
+                <w:sz w:val="20"/>
+              </w:rPr>
+              <w:t xml:space="preserve">Não sequencial</w:t>
+            </w:r>
+            <w:r>
+              <w:rPr>
+                <w:sz w:val="20"/>
+              </w:rPr>
+              <w:t xml:space="preserve"> (o servidor confere cada pagamento no Asaas e aceita avisos fora de ordem; uma falha não trava a fila)</w:t>
+            </w:r>
+          </w:p>
+        </w:tc>
+      </w:tr>
+      <w:tr>
+        <w:tc>
+          <w:tcPr>
+            <w:tcW w:w="4700" w:type="dxa"/>
+          </w:tcPr>
+          <w:p>
+            <w:pPr>
+              <w:spacing w:after="0"/>
+            </w:pPr>
+            <w:r>
+              <w:rPr>
+                <w:b/>
+                <w:sz w:val="20"/>
+              </w:rPr>
+              <w:t xml:space="preserve">Fila de sincronização ativada?</w:t>
+            </w:r>
+          </w:p>
+        </w:tc>
+        <w:tc>
+          <w:tcPr>
+            <w:tcW w:w="4700" w:type="dxa"/>
+          </w:tcPr>
+          <w:p>
+            <w:pPr>
+              <w:spacing w:after="0"/>
+            </w:pPr>
+            <w:r>
+              <w:rPr>
+                <w:b/>
+                <w:sz w:val="20"/>
+              </w:rPr>
+              <w:t xml:space="preserve">Ligada.</w:t>
+            </w:r>
+            <w:r>
+              <w:rPr>
+                <w:sz w:val="20"/>
+              </w:rPr>
+              <w:t xml:space="preserve"> Desligada, o Asaas não envia nenhum aviso ao site</w:t>
+            </w:r>
+          </w:p>
+        </w:tc>
+      </w:tr>
+      <w:tr>
+        <w:tc>
+          <w:tcPr>
+            <w:tcW w:w="4700" w:type="dxa"/>
+          </w:tcPr>
+          <w:p>
+            <w:pPr>
+              <w:spacing w:after="0"/>
+            </w:pPr>
+            <w:r>
+              <w:rPr>
+                <w:sz w:val="20"/>
+              </w:rPr>
+              <w:t xml:space="preserve">Token de autenticação</w:t>
+            </w:r>
+          </w:p>
+        </w:tc>
+        <w:tc>
+          <w:tcPr>
+            <w:tcW w:w="4700" w:type="dxa"/>
+          </w:tcPr>
+          <w:p>
+            <w:pPr>
+              <w:spacing w:after="0"/>
+            </w:pPr>
+            <w:r>
+              <w:rPr>
+                <w:sz w:val="20"/>
+              </w:rPr>
+              <w:t xml:space="preserve">Clique em </w:t>
+            </w:r>
+            <w:r>
+              <w:rPr>
+                <w:b/>
+                <w:sz w:val="20"/>
+              </w:rPr>
+              <w:t xml:space="preserve">Gerar Token</w:t>
+            </w:r>
+            <w:r>
+              <w:rPr>
+                <w:sz w:val="20"/>
+              </w:rPr>
+              <w:t xml:space="preserve"> e guarde o valor no gerenciador de senhas. </w:t>
+            </w:r>
+            <w:r>
+              <w:rPr>
+                <w:b/>
+                <w:sz w:val="20"/>
+              </w:rPr>
+              <w:t xml:space="preserve">Nunca tire print com o token à mostra.</w:t>
+            </w:r>
+            <w:r>
+              <w:rPr>
+                <w:sz w:val="20"/>
+              </w:rPr>
+              <w:t xml:space="preserve"> É o mesmo valor do segredo </w:t>
+            </w:r>
+            <w:r>
+              <w:rPr>
+                <w:rFonts w:ascii="Consolas" w:hAnsi="Consolas" w:cs="Consolas"/>
+                <w:color w:val="7A2E0E"/>
+                <w:sz w:val="20"/>
+              </w:rPr>
+              <w:t xml:space="preserve">ASAAS_WEBHOOK_TOKEN</w:t>
+            </w:r>
+          </w:p>
+        </w:tc>
+      </w:tr>
+    </w:tbl>
+    <w:p>
+      <w:pPr>
+        <w:spacing w:after="60"/>
+      </w:pPr>
+    </w:p>
+    <w:p>
+      <w:pPr>
+        <w:spacing w:after="120"/>
+      </w:pPr>
+      <w:r>
+        <w:rPr>
+          <w:b/>
+        </w:rPr>
+        <w:t xml:space="preserve">Eventos</w:t>
+      </w:r>
+      <w:r>
+        <w:rPr/>
+        <w:t xml:space="preserve"> (abra cada grupo e marque só estes):</w:t>
+      </w:r>
+    </w:p>
+    <w:p>
+      <w:pPr>
+        <w:spacing w:after="60"/>
+        <w:ind w:left="560" w:hanging="300"/>
+      </w:pPr>
+      <w:r>
+        <w:rPr/>
+        <w:t xml:space="preserve">•  </w:t>
+      </w:r>
+      <w:r>
+        <w:rPr>
+          <w:b/>
+        </w:rPr>
+        <w:t xml:space="preserve">Cobranças:</w:t>
+      </w:r>
+      <w:r>
+        <w:rPr/>
+        <w:t xml:space="preserve"> pagamento recebido (</w:t>
       </w:r>
       <w:r>
         <w:rPr>
@@ -465,7 +823,7 @@
       </w:r>
       <w:r>
         <w:rPr/>
-        <w:t xml:space="preserve">, </w:t>
+        <w:t xml:space="preserve">), pagamento confirmado (</w:t>
       </w:r>
       <w:r>
         <w:rPr>
@@ -476,7 +834,7 @@
       </w:r>
       <w:r>
         <w:rPr/>
-        <w:t xml:space="preserve"> e </w:t>
+        <w:t xml:space="preserve">) e captura recusada no cartão (</w:t>
       </w:r>
       <w:r>
         <w:rPr>
@@ -487,17 +845,27 @@
       </w:r>
       <w:r>
         <w:rPr/>
-        <w:t xml:space="preserve">. </w:t>
-      </w:r>
-      <w:r>
-        <w:rPr>
-          <w:b/>
-        </w:rPr>
-        <w:t xml:space="preserve">Eventos de assinatura:</w:t>
-      </w:r>
-      <w:r>
-        <w:rPr/>
-        <w:t xml:space="preserve"> marque </w:t>
+        <w:t xml:space="preserve">).</w:t>
+      </w:r>
+    </w:p>
+    <w:p>
+      <w:pPr>
+        <w:spacing w:after="60"/>
+        <w:ind w:left="560" w:hanging="300"/>
+      </w:pPr>
+      <w:r>
+        <w:rPr/>
+        <w:t xml:space="preserve">•  </w:t>
+      </w:r>
+      <w:r>
+        <w:rPr>
+          <w:b/>
+        </w:rPr>
+        <w:t xml:space="preserve">Assinaturas</w:t>
+      </w:r>
+      <w:r>
+        <w:rPr/>
+        <w:t xml:space="preserve"> (role a lista se não aparecer): assinatura removida (</w:t>
       </w:r>
       <w:r>
         <w:rPr>
@@ -508,7 +876,7 @@
       </w:r>
       <w:r>
         <w:rPr/>
-        <w:t xml:space="preserve"> e </w:t>
+        <w:t xml:space="preserve">) e assinatura inativada (</w:t>
       </w:r>
       <w:r>
         <w:rPr>
@@ -519,23 +887,46 @@
       </w:r>
       <w:r>
         <w:rPr/>
+        <w:t xml:space="preserve">).</w:t>
+      </w:r>
+    </w:p>
+    <w:p>
+      <w:pPr>
+        <w:spacing w:after="60"/>
+        <w:ind w:left="560" w:hanging="300"/>
+      </w:pPr>
+      <w:r>
+        <w:rPr/>
+        <w:t xml:space="preserve">•  </w:t>
+      </w:r>
+      <w:r>
+        <w:rPr>
+          <w:b/>
+        </w:rPr>
+        <w:t xml:space="preserve">Notas fiscais, Transferências, Pague contas e Antecipações:</w:t>
+      </w:r>
+      <w:r>
+        <w:rPr/>
+        <w:t xml:space="preserve"> nenhum.</w:t>
+      </w:r>
+    </w:p>
+    <w:p>
+      <w:pPr>
+        <w:spacing w:after="120"/>
+      </w:pPr>
+      <w:r>
+        <w:rPr/>
+        <w:t xml:space="preserve">Clique em </w:t>
+      </w:r>
+      <w:r>
+        <w:rPr>
+          <w:b/>
+        </w:rPr>
+        <w:t xml:space="preserve">Salvar</w:t>
+      </w:r>
+      <w:r>
+        <w:rPr/>
         <w:t xml:space="preserve">.</w:t>
-      </w:r>
-    </w:p>
-    <w:p>
-      <w:pPr>
-        <w:spacing w:after="80"/>
-        <w:ind w:left="560" w:hanging="400"/>
-      </w:pPr>
-      <w:r>
-        <w:rPr>
-          <w:b/>
-        </w:rPr>
-        <w:t xml:space="preserve">4.  </w:t>
-      </w:r>
-      <w:r>
-        <w:rPr/>
-        <w:t xml:space="preserve">Salve.</w:t>
       </w:r>
     </w:p>
     <w:p>

</xml_diff>